<commit_message>
feature: Add outlier reduction analysis, plotting for topic evolution in BERTopic
</commit_message>
<xml_diff>
--- a/results/tables/Table S20.docx
+++ b/results/tables/Table S20.docx
@@ -51,11 +51,9 @@
             <w:pPr>
               <w:jc w:val="right"/>
             </w:pPr>
-            <w:proofErr w:type="spellStart"/>
             <w:r>
               <w:t>Estimate</w:t>
             </w:r>
-            <w:proofErr w:type="spellEnd"/>
           </w:p>
         </w:tc>
         <w:tc>
@@ -70,13 +68,9 @@
             <w:pPr>
               <w:jc w:val="right"/>
             </w:pPr>
-            <w:proofErr w:type="spellStart"/>
-            <w:proofErr w:type="gramStart"/>
             <w:r>
               <w:t>sd</w:t>
             </w:r>
-            <w:proofErr w:type="spellEnd"/>
-            <w:proofErr w:type="gramEnd"/>
           </w:p>
         </w:tc>
         <w:tc>
@@ -91,13 +85,8 @@
             <w:pPr>
               <w:jc w:val="right"/>
             </w:pPr>
-            <w:proofErr w:type="gramStart"/>
-            <w:r>
-              <w:t>t</w:t>
-            </w:r>
-            <w:proofErr w:type="gramEnd"/>
-            <w:r>
-              <w:t>-value</w:t>
+            <w:r>
+              <w:t>t-value</w:t>
             </w:r>
           </w:p>
         </w:tc>
@@ -113,13 +102,8 @@
             <w:pPr>
               <w:jc w:val="right"/>
             </w:pPr>
-            <w:proofErr w:type="gramStart"/>
-            <w:r>
-              <w:t>p</w:t>
-            </w:r>
-            <w:proofErr w:type="gramEnd"/>
-            <w:r>
-              <w:t>-value</w:t>
+            <w:r>
+              <w:t>p-value</w:t>
             </w:r>
           </w:p>
         </w:tc>
@@ -1039,7 +1023,7 @@
                 <w:sz w:val="22"/>
                 <w:szCs w:val="22"/>
               </w:rPr>
-              <w:t>0.32 </w:t>
+              <w:t>0.32</w:t>
             </w:r>
           </w:p>
         </w:tc>

</xml_diff>